<commit_message>
Drop the group code from the team name and widen columns
Rename the team to "20/80" without the group suffix everywhere: the
stakeholder register, the grid footer, the RACI matrix, the communication
plan and both filled templates, including the project team directory and
the body text of the communications management plan.

Widen the columns of the register, the RACI activity column and the
communication plan so the wrapped text fits without clipping, and raise
the row heights to match.

Co-Authored-By: Claude Opus 5 <noreply@anthropic.com>
</commit_message>
<xml_diff>
--- a/BA/Part 1_Stakeholder Analysis amp Management-20260912/TemplatesFinal/SH Management_Communications Management Plan Template.docx
+++ b/BA/Part 1_Stakeholder Analysis amp Management-20260912/TemplatesFinal/SH Management_Communications Management Plan Template.docx
@@ -2068,7 +2068,7 @@
     </w:p>
     <w:p>
       <w:r>
-        <w:t>The Project Team is team "20/80", six students of group SHI-2025 who perform the work on the project: Kostiantyn Holovskyi (Product Owner), Nazar Zankovych (Project Manager), Andrii Lysun (Business Analyst), Denys Lunhul (Tech Lead), Yaroslav Shevchuk (DevOps) and Volodymyr Kamelchuk (QA Specialist). The team is based at 5 Lukasha Street, Lviv. It requires a detailed level of communication, achieved through a daily stand-up, a weekly planning session, a weekly technical sync and a fortnightly retrospective.</w:t>
+        <w:t>The Project Team is team "20/80", six students who perform the work on the project: Kostiantyn Holovskyi (Product Owner), Nazar Zankovych (Project Manager), Andrii Lysun (Business Analyst), Denys Lunhul (Tech Lead), Yaroslav Shevchuk (DevOps) and Volodymyr Kamelchuk (QA Specialist). The team is based at 5 Lukasha Street, Lviv. It requires a detailed level of communication, achieved through a daily stand-up, a weekly planning session, a weekly technical sync and a fortnightly retrospective.</w:t>
       </w:r>
     </w:p>
     <w:p/>
@@ -2736,7 +2736,7 @@
           <w:p>
             <w:r/>
             <w:r>
-              <w:t>Project team “20/80”, group SHI-2025</w:t>
+              <w:t>Project team “20/80”</w:t>
             </w:r>
           </w:p>
         </w:tc>
@@ -2804,7 +2804,7 @@
           <w:p>
             <w:r/>
             <w:r>
-              <w:t>Project team “20/80”, group SHI-2025</w:t>
+              <w:t>Project team “20/80”</w:t>
             </w:r>
           </w:p>
         </w:tc>
@@ -2872,7 +2872,7 @@
           <w:p>
             <w:r/>
             <w:r>
-              <w:t>Project team “20/80”, group SHI-2025</w:t>
+              <w:t>Project team “20/80”</w:t>
             </w:r>
           </w:p>
         </w:tc>
@@ -2940,7 +2940,7 @@
           <w:p>
             <w:r/>
             <w:r>
-              <w:t>Project team “20/80”, group SHI-2025</w:t>
+              <w:t>Project team “20/80”</w:t>
             </w:r>
           </w:p>
         </w:tc>
@@ -3008,7 +3008,7 @@
           <w:p>
             <w:r/>
             <w:r>
-              <w:t>Project team “20/80”, group SHI-2025</w:t>
+              <w:t>Project team “20/80”</w:t>
             </w:r>
           </w:p>
         </w:tc>
@@ -3076,7 +3076,7 @@
           <w:p>
             <w:r/>
             <w:r>
-              <w:t>Project team “20/80”, group SHI-2025</w:t>
+              <w:t>Project team “20/80”</w:t>
             </w:r>
           </w:p>
         </w:tc>
@@ -5684,7 +5684,7 @@
     <w:p/>
     <w:p>
       <w:r>
-        <w:t>Business Analysis coursework · Project team "VNS", group SHI-2025 · Lviv Polytechnic National University</w:t>
+        <w:t>Business Analysis coursework · Project team "VNS" · Lviv Polytechnic National University</w:t>
       </w:r>
     </w:p>
     <w:p/>

</xml_diff>